<commit_message>
Produs: campania F230 doar la donatori cu acord de email; bifa de donatie nu mai trimite la Termenii B2B; cookies pseudonimizat; Termeni: minimizare date medicale/AI; dosar jurist actualizat
Co-Authored-By: Claude Sonnet 5.5 <noreply@anthropic.com>
</commit_message>
<xml_diff>
--- a/documentation/dosar-verificare-juridica.docx
+++ b/documentation/dosar-verificare-juridica.docx
@@ -2716,43 +2716,43 @@
           <w:sz w:val="21"/>
           <w:szCs w:val="21"/>
         </w:rPr>
-        <w:t xml:space="preserve">Donatorii introduși înainte de existența bifei separate pentru email au consimțământul de email „necunoscut” și continuă să primească reamintirea anuală de Formular 230, cu link de dezabonare. Cerem opinia asupra acestei abordări (art. 12 din Legea 506/2004).</w:t>
-      </w:r>
-    </w:p>
-    <w:p>
-      <w:pPr>
-        <w:pStyle w:val="ListParagraph"/>
-        <w:numPr>
-          <w:ilvl w:val="0"/>
-          <w:numId w:val="3"/>
-        </w:numPr>
-        <w:spacing w:after="70" w:line="270"/>
-      </w:pPr>
-      <w:r>
-        <w:rPr>
-          <w:rFonts w:ascii="Arial" w:cs="Arial" w:eastAsia="Arial" w:hAnsi="Arial"/>
-          <w:sz w:val="21"/>
-          <w:szCs w:val="21"/>
-        </w:rPr>
-        <w:t xml:space="preserve">Bifa „Termeni” de pe pagina de donație trimite încă la Termenii B2B ai platformei, nu la informarea ONG-ului — de reformulat/decis.</w:t>
-      </w:r>
-    </w:p>
-    <w:p>
-      <w:pPr>
-        <w:pStyle w:val="ListParagraph"/>
-        <w:numPr>
-          <w:ilvl w:val="0"/>
-          <w:numId w:val="3"/>
-        </w:numPr>
-        <w:spacing w:after="70" w:line="270"/>
-      </w:pPr>
-      <w:r>
-        <w:rPr>
-          <w:rFonts w:ascii="Arial" w:cs="Arial" w:eastAsia="Arial" w:hAnsi="Arial"/>
-          <w:sz w:val="21"/>
-          <w:szCs w:val="21"/>
-        </w:rPr>
-        <w:t xml:space="preserve">Bannerul de cookies vorbește despre „statistici anonime”, deși GA4 este pseudonimizat — de reformulat.</w:t>
+        <w:t xml:space="preserve">Rezolvat la 5 octombrie 2026: reamintirea anuală de Formular 230 se trimite doar donatorilor care au bifat explicit emailurile; donatorii „legacy” (consimțământ necunoscut) nu mai primesc campania.</w:t>
+      </w:r>
+    </w:p>
+    <w:p>
+      <w:pPr>
+        <w:pStyle w:val="ListParagraph"/>
+        <w:numPr>
+          <w:ilvl w:val="0"/>
+          <w:numId w:val="3"/>
+        </w:numPr>
+        <w:spacing w:after="70" w:line="270"/>
+      </w:pPr>
+      <w:r>
+        <w:rPr>
+          <w:rFonts w:ascii="Arial" w:cs="Arial" w:eastAsia="Arial" w:hAnsi="Arial"/>
+          <w:sz w:val="21"/>
+          <w:szCs w:val="21"/>
+        </w:rPr>
+        <w:t xml:space="preserve">Rezolvat la 5 octombrie 2026: a doua bifă de pe pagina de donație (și mențiunea de la plata rapidă) nu mai trimite la Termenii B2B ai platformei; confirmă donația de bunăvoie, procesarea plății de către Stripe și faptul că ONG-ul este operatorul datelor.</w:t>
+      </w:r>
+    </w:p>
+    <w:p>
+      <w:pPr>
+        <w:pStyle w:val="ListParagraph"/>
+        <w:numPr>
+          <w:ilvl w:val="0"/>
+          <w:numId w:val="3"/>
+        </w:numPr>
+        <w:spacing w:after="70" w:line="270"/>
+      </w:pPr>
+      <w:r>
+        <w:rPr>
+          <w:rFonts w:ascii="Arial" w:cs="Arial" w:eastAsia="Arial" w:hAnsi="Arial"/>
+          <w:sz w:val="21"/>
+          <w:szCs w:val="21"/>
+        </w:rPr>
+        <w:t xml:space="preserve">Rezolvat la 5 octombrie 2026: bannerul de cookies spune acum „date pseudonimizate, nu complet anonime”. Cerem totuși validarea formulării.</w:t>
       </w:r>
     </w:p>
     <w:p>
@@ -3352,7 +3352,7 @@
           <w:sz w:val="21"/>
           <w:szCs w:val="21"/>
         </w:rPr>
-        <w:t xml:space="preserve">Emailurile anuale de reamintire Formular 230 către donatorii „legacy” (fără bifă separată): admisibile, sau trebuie retrase/re-cerute? Cum aplicăm art. 12 din Legea 506/2004 (exceptarea pentru clienți existenți)?</w:t>
+        <w:t xml:space="preserve">Emailurile anuale de reamintire Formular 230 se trimit acum doar donatorilor cu consimțământ explicit de email; donatorii „legacy” (consimțământ necunoscut) sunt excluși. Este suficient, sau există și alte categorii de destinatari cu risc (de exemplu donatori care au bifat altceva)? Cum aplicăm art. 12 din Legea 506/2004 pentru eventuale comunicări către clienții existenți?</w:t>
       </w:r>
     </w:p>
     <w:p>
@@ -3376,7 +3376,7 @@
           <w:sz w:val="21"/>
           <w:szCs w:val="21"/>
         </w:rPr>
-        <w:t xml:space="preserve">Bannerul și Politica de cookies (GA4 doar cu acord; cookie-uri strict necesare; Calendly încărcat după click) respectă cerințele actuale? Cum reformulăm „statistici anonime”?</w:t>
+        <w:t xml:space="preserve">Bannerul și Politica de cookies (GA4 doar cu acord; cookie-uri strict necesare; Calendly încărcat după click) respectă cerințele actuale? Este corectă formularea „date pseudonimizate, nu complet anonime”?</w:t>
       </w:r>
     </w:p>
     <w:p>
@@ -3574,7 +3574,7 @@
           <w:sz w:val="21"/>
           <w:szCs w:val="21"/>
         </w:rPr>
-        <w:t xml:space="preserve">Ultima actualizare: 21 septembrie 2026</w:t>
+        <w:t xml:space="preserve">Ultima actualizare: 5 octombrie 2026</w:t>
       </w:r>
     </w:p>
     <w:p>
@@ -4235,7 +4235,7 @@
           <w:sz w:val="21"/>
           <w:szCs w:val="21"/>
         </w:rPr>
-        <w:t xml:space="preserve">Organizația este operator pentru datele persoanelor pe care le introduce în Platformă. Se obligă să aibă temeiul legal necesar (de exemplu consimțământul, contractul sau interesul legitim), să își informeze persoanele vizate, să respecte regulile privind comunicările comerciale (inclusiv dezabonarea) și să nu introducă date pe care nu are dreptul să le prelucreze. Pentru date speciale, în special date medicale și date despre minori, Organizația răspunde de obținerea consimțământului explicit și a acordului reprezentantului legal.</w:t>
+        <w:t xml:space="preserve">Organizația este operator pentru datele persoanelor pe care le introduce în Platformă. Se obligă să aibă temeiul legal necesar (de exemplu consimțământul, contractul sau interesul legitim), să își informeze persoanele vizate, să respecte regulile privind comunicările comerciale (inclusiv dezabonarea) și să nu introducă date pe care nu are dreptul să le prelucreze. Pentru date speciale, în special date medicale și date despre minori, Organizația răspunde de obținerea consimțământului explicit și a acordului reprezentantului legal și se obligă să introducă doar datele strict necesare, evitând detaliile medicale identificabile în câmpurile libere și în textele trimise funcțiilor AI.</w:t>
       </w:r>
     </w:p>
     <w:p>
@@ -6159,7 +6159,7 @@
           <w:sz w:val="21"/>
           <w:szCs w:val="21"/>
         </w:rPr>
-        <w:t xml:space="preserve">Ultima actualizare: 2 octombrie 2026</w:t>
+        <w:t xml:space="preserve">Ultima actualizare: 5 octombrie 2026</w:t>
       </w:r>
     </w:p>
     <w:p>
@@ -7212,7 +7212,7 @@
           <w:sz w:val="21"/>
           <w:szCs w:val="21"/>
         </w:rPr>
-        <w:t xml:space="preserve">Cookie-uri și statistici. Folosim cookie-uri strict necesare pentru autentificare. Cu acordul tău, folosim și Google Analytics pentru statistici anonime despre utilizarea site-ului. Poți schimba alegerea oricând. [Butoane: „Accept statisticile” / „Refuz”]</w:t>
+        <w:t xml:space="preserve">Cookie-uri și statistici. Folosim cookie-uri strict necesare pentru autentificare. Cu acordul tău, folosim și Google Analytics pentru statistici despre utilizarea site-ului (date pseudonimizate, nu complet anonime). Poți schimba alegerea oricând. [Butoane: „Accept statisticile” / „Refuz”]</w:t>
       </w:r>
     </w:p>
     <w:p>

</xml_diff>

<commit_message>
Dosar jurist: scoase punctele deja rezolvate din 3.3
Co-Authored-By: Claude Sonnet 5.5 <noreply@anthropic.com>
</commit_message>
<xml_diff>
--- a/documentation/dosar-verificare-juridica.docx
+++ b/documentation/dosar-verificare-juridica.docx
@@ -2716,60 +2716,6 @@
           <w:sz w:val="21"/>
           <w:szCs w:val="21"/>
         </w:rPr>
-        <w:t xml:space="preserve">Rezolvat la 5 octombrie 2026: reamintirea anuală de Formular 230 se trimite doar donatorilor care au bifat explicit emailurile; donatorii „legacy” (consimțământ necunoscut) nu mai primesc campania.</w:t>
-      </w:r>
-    </w:p>
-    <w:p>
-      <w:pPr>
-        <w:pStyle w:val="ListParagraph"/>
-        <w:numPr>
-          <w:ilvl w:val="0"/>
-          <w:numId w:val="3"/>
-        </w:numPr>
-        <w:spacing w:after="70" w:line="270"/>
-      </w:pPr>
-      <w:r>
-        <w:rPr>
-          <w:rFonts w:ascii="Arial" w:cs="Arial" w:eastAsia="Arial" w:hAnsi="Arial"/>
-          <w:sz w:val="21"/>
-          <w:szCs w:val="21"/>
-        </w:rPr>
-        <w:t xml:space="preserve">Rezolvat la 5 octombrie 2026: a doua bifă de pe pagina de donație (și mențiunea de la plata rapidă) nu mai trimite la Termenii B2B ai platformei; confirmă donația de bunăvoie, procesarea plății de către Stripe și faptul că ONG-ul este operatorul datelor.</w:t>
-      </w:r>
-    </w:p>
-    <w:p>
-      <w:pPr>
-        <w:pStyle w:val="ListParagraph"/>
-        <w:numPr>
-          <w:ilvl w:val="0"/>
-          <w:numId w:val="3"/>
-        </w:numPr>
-        <w:spacing w:after="70" w:line="270"/>
-      </w:pPr>
-      <w:r>
-        <w:rPr>
-          <w:rFonts w:ascii="Arial" w:cs="Arial" w:eastAsia="Arial" w:hAnsi="Arial"/>
-          <w:sz w:val="21"/>
-          <w:szCs w:val="21"/>
-        </w:rPr>
-        <w:t xml:space="preserve">Rezolvat la 5 octombrie 2026: bannerul de cookies spune acum „date pseudonimizate, nu complet anonime”. Cerem totuși validarea formulării.</w:t>
-      </w:r>
-    </w:p>
-    <w:p>
-      <w:pPr>
-        <w:pStyle w:val="ListParagraph"/>
-        <w:numPr>
-          <w:ilvl w:val="0"/>
-          <w:numId w:val="3"/>
-        </w:numPr>
-        <w:spacing w:after="70" w:line="270"/>
-      </w:pPr>
-      <w:r>
-        <w:rPr>
-          <w:rFonts w:ascii="Arial" w:cs="Arial" w:eastAsia="Arial" w:hAnsi="Arial"/>
-          <w:sz w:val="21"/>
-          <w:szCs w:val="21"/>
-        </w:rPr>
         <w:t xml:space="preserve">Documentele sunt redactate intern; nu au fost verificate de un jurist sau DPO.</w:t>
       </w:r>
     </w:p>

</xml_diff>